<commit_message>
072225 - updated scores for week 12
</commit_message>
<xml_diff>
--- a/public/docs/How to update league round scores and post them to the website.docx
+++ b/public/docs/How to update league round scores and post them to the website.docx
@@ -20,6 +20,11 @@
     <w:p>
       <w:r>
         <w:t>Basic understanding of HTML/CSS (some JavaScript) – not necessarily required for these actions.</w:t>
+      </w:r>
+    </w:p>
+    <w:p>
+      <w:r>
+        <w:t>Need scorecards and closet to the pin data for that week.</w:t>
       </w:r>
     </w:p>
     <w:p/>
@@ -278,6 +283,214 @@
           <w:numId w:val="1"/>
         </w:numPr>
       </w:pPr>
+      <w:r>
+        <w:t>Remove/delete the player names, their scores, and their handicap from the current week’s tab/worksheet</w:t>
+      </w:r>
+    </w:p>
+    <w:p>
+      <w:pPr>
+        <w:pStyle w:val="ListParagraph"/>
+        <w:numPr>
+          <w:ilvl w:val="1"/>
+          <w:numId w:val="1"/>
+        </w:numPr>
+      </w:pPr>
+      <w:r>
+        <w:t>Open “2025 Overall Standings.xlsx”</w:t>
+      </w:r>
+    </w:p>
+    <w:p>
+      <w:pPr>
+        <w:pStyle w:val="ListParagraph"/>
+        <w:numPr>
+          <w:ilvl w:val="2"/>
+          <w:numId w:val="1"/>
+        </w:numPr>
+      </w:pPr>
+      <w:r>
+        <w:t>Use this to capture the players handicaps for the current weeks’ scoring</w:t>
+      </w:r>
+    </w:p>
+    <w:p>
+      <w:pPr>
+        <w:pStyle w:val="ListParagraph"/>
+        <w:numPr>
+          <w:ilvl w:val="1"/>
+          <w:numId w:val="1"/>
+        </w:numPr>
+      </w:pPr>
+      <w:r>
+        <w:t>Add the player names and handicap to the tab/worksheet</w:t>
+      </w:r>
+    </w:p>
+    <w:p>
+      <w:pPr>
+        <w:pStyle w:val="ListParagraph"/>
+        <w:numPr>
+          <w:ilvl w:val="1"/>
+          <w:numId w:val="1"/>
+        </w:numPr>
+      </w:pPr>
+      <w:r>
+        <w:t xml:space="preserve">Add the player scores to the tab/worksheet </w:t>
+      </w:r>
+    </w:p>
+    <w:p>
+      <w:pPr>
+        <w:pStyle w:val="ListParagraph"/>
+        <w:numPr>
+          <w:ilvl w:val="2"/>
+          <w:numId w:val="1"/>
+        </w:numPr>
+      </w:pPr>
+      <w:r>
+        <w:t>Their net points per hole are calculated automatically via formula</w:t>
+      </w:r>
+    </w:p>
+    <w:p>
+      <w:pPr>
+        <w:pStyle w:val="ListParagraph"/>
+        <w:numPr>
+          <w:ilvl w:val="2"/>
+          <w:numId w:val="1"/>
+        </w:numPr>
+      </w:pPr>
+      <w:r>
+        <w:t>If I player makes a gross (straight up) birdie highlight the cell in green.</w:t>
+      </w:r>
+    </w:p>
+    <w:p>
+      <w:pPr>
+        <w:pStyle w:val="ListParagraph"/>
+        <w:numPr>
+          <w:ilvl w:val="3"/>
+          <w:numId w:val="1"/>
+        </w:numPr>
+      </w:pPr>
+      <w:r>
+        <w:lastRenderedPageBreak/>
+        <w:t>This is used to update the players birdie points</w:t>
+      </w:r>
+    </w:p>
+    <w:p>
+      <w:pPr>
+        <w:pStyle w:val="ListParagraph"/>
+        <w:numPr>
+          <w:ilvl w:val="0"/>
+          <w:numId w:val="1"/>
+        </w:numPr>
+      </w:pPr>
+      <w:r>
+        <w:t>In the “2025 Overall Standings.xlsx” spreadsheet:</w:t>
+      </w:r>
+    </w:p>
+    <w:p>
+      <w:pPr>
+        <w:pStyle w:val="ListParagraph"/>
+        <w:numPr>
+          <w:ilvl w:val="1"/>
+          <w:numId w:val="1"/>
+        </w:numPr>
+      </w:pPr>
+      <w:r>
+        <w:t>Copy the previous weeks SCORE and POINTS columns</w:t>
+      </w:r>
+    </w:p>
+    <w:p>
+      <w:pPr>
+        <w:pStyle w:val="ListParagraph"/>
+        <w:numPr>
+          <w:ilvl w:val="1"/>
+          <w:numId w:val="1"/>
+        </w:numPr>
+      </w:pPr>
+      <w:r>
+        <w:t>Paste them next to the previous week’s columns</w:t>
+      </w:r>
+    </w:p>
+    <w:p>
+      <w:pPr>
+        <w:pStyle w:val="ListParagraph"/>
+        <w:numPr>
+          <w:ilvl w:val="1"/>
+          <w:numId w:val="1"/>
+        </w:numPr>
+      </w:pPr>
+      <w:r>
+        <w:t>Delete/clear all scores and fill/highlighted styling.</w:t>
+      </w:r>
+    </w:p>
+    <w:p>
+      <w:pPr>
+        <w:pStyle w:val="ListParagraph"/>
+        <w:numPr>
+          <w:ilvl w:val="1"/>
+          <w:numId w:val="1"/>
+        </w:numPr>
+      </w:pPr>
+      <w:r>
+        <w:t>Update the header with the current week and correct date.</w:t>
+      </w:r>
+    </w:p>
+    <w:p>
+      <w:pPr>
+        <w:pStyle w:val="ListParagraph"/>
+        <w:numPr>
+          <w:ilvl w:val="1"/>
+          <w:numId w:val="1"/>
+        </w:numPr>
+      </w:pPr>
+      <w:r>
+        <w:t>Transfer each players score and total points to the Overall Standing columns you created.</w:t>
+      </w:r>
+    </w:p>
+    <w:p>
+      <w:pPr>
+        <w:pStyle w:val="ListParagraph"/>
+        <w:numPr>
+          <w:ilvl w:val="1"/>
+          <w:numId w:val="1"/>
+        </w:numPr>
+      </w:pPr>
+      <w:r>
+        <w:t>Change the font color for the players who were closest to the pin</w:t>
+      </w:r>
+    </w:p>
+    <w:p>
+      <w:pPr>
+        <w:pStyle w:val="ListParagraph"/>
+        <w:numPr>
+          <w:ilvl w:val="2"/>
+          <w:numId w:val="1"/>
+        </w:numPr>
+      </w:pPr>
+      <w:r>
+        <w:t>Red/Bold = #4</w:t>
+      </w:r>
+    </w:p>
+    <w:p>
+      <w:pPr>
+        <w:pStyle w:val="ListParagraph"/>
+        <w:numPr>
+          <w:ilvl w:val="2"/>
+          <w:numId w:val="1"/>
+        </w:numPr>
+      </w:pPr>
+      <w:r>
+        <w:t>Green/Bold = #7</w:t>
+      </w:r>
+    </w:p>
+    <w:p>
+      <w:pPr>
+        <w:pStyle w:val="ListParagraph"/>
+        <w:numPr>
+          <w:ilvl w:val="2"/>
+          <w:numId w:val="1"/>
+        </w:numPr>
+      </w:pPr>
+      <w:r>
+        <w:t>Blue/Bold = Both</w:t>
+      </w:r>
     </w:p>
     <w:sectPr>
       <w:pgSz w:w="12240" w:h="15840"/>
@@ -316,7 +529,7 @@
         <w:ind w:left="1440" w:hanging="360"/>
       </w:pPr>
     </w:lvl>
-    <w:lvl w:ilvl="2" w:tplc="0409001B" w:tentative="1">
+    <w:lvl w:ilvl="2" w:tplc="0409001B">
       <w:start w:val="1"/>
       <w:numFmt w:val="lowerRoman"/>
       <w:lvlText w:val="%3."/>
@@ -325,7 +538,7 @@
         <w:ind w:left="2160" w:hanging="180"/>
       </w:pPr>
     </w:lvl>
-    <w:lvl w:ilvl="3" w:tplc="0409000F" w:tentative="1">
+    <w:lvl w:ilvl="3" w:tplc="0409000F">
       <w:start w:val="1"/>
       <w:numFmt w:val="decimal"/>
       <w:lvlText w:val="%4."/>

</xml_diff>

<commit_message>
072525 - update doc for adding scored
</commit_message>
<xml_diff>
--- a/public/docs/How to update league round scores and post them to the website.docx
+++ b/public/docs/How to update league round scores and post them to the website.docx
@@ -490,6 +490,18 @@
       </w:pPr>
       <w:r>
         <w:t>Blue/Bold = Both</w:t>
+      </w:r>
+    </w:p>
+    <w:p>
+      <w:pPr>
+        <w:pStyle w:val="ListParagraph"/>
+        <w:numPr>
+          <w:ilvl w:val="1"/>
+          <w:numId w:val="1"/>
+        </w:numPr>
+      </w:pPr>
+      <w:r>
+        <w:t>Each player’s handicap updates automatically via formula.</w:t>
       </w:r>
     </w:p>
     <w:sectPr>

</xml_diff>